<commit_message>
EKG-URT-PRS-02 — Devreye Alma (Start-up) ve Set-up Doğrulama Prosedürü
</commit_message>
<xml_diff>
--- a/EKG_Kalite_Yönetim_Sistemi/05_Üretime Başlangıç ve Hata Önleme/01_SP&EP1 - Başlangıç ve İlk Parça/EKG-URT-PRS-02_Devreye Alma (Start-up) ve Set-up Doğrulama Prosedürü.docx
+++ b/EKG_Kalite_Yönetim_Sistemi/05_Üretime Başlangıç ve Hata Önleme/01_SP&EP1 - Başlangıç ve İlk Parça/EKG-URT-PRS-02_Devreye Alma (Start-up) ve Set-up Doğrulama Prosedürü.docx
@@ -677,17 +677,35 @@
         <w:pStyle w:val="Heading1"/>
       </w:pPr>
       <w:r>
+        <w:t>11 Başlangıç etkinliğinin izlenmesi</w:t>
+      </w:r>
+    </w:p>
+    <w:p>
+      <w:r>
+        <w:t>Üretim ve Kalite, tanımlı raporlama döneminde EKG-URT-FRM-02 olay kayıtlarından planlanan/yapılan başlangıçları, başarısız veya eksik kontrolleri ve tekrarlayan başlangıç nedenlerini izler. Başlangıç sapmasına bağlı duruş ve hurda gerçek olay/ürün karar kayıtlarıyla ilişkilendirilir; EP arızaları EKG-KLT-FRM-10 ile ayrıca bağlanır. Eksik kayıt başarılı başlatma veya sıfır kayıp sayılmaz.</w:t>
+      </w:r>
+    </w:p>
+    <w:p>
+      <w:r>
+        <w:t>Baskın başlangıç/ayar hataları, duruş ve hurda nedenleri görsel takip ve uygun Pareto analiziyle gözden geçirilir; başlıca nedenlere sorumlu, termin ve doğrulanabilir etkinlik ölçütüyle aksiyon atanır. Sonuçlara göre başlangıç standardı, görev/sıklık, eğitim veya proses/ekipman kontrolü güncellenir. Bir aksiyonun tamamlanması etkinliğinin kanıtlandığı anlamına gelmez.</w:t>
+      </w:r>
+    </w:p>
+    <w:p>
+      <w:pPr>
+        <w:pStyle w:val="Heading1"/>
+      </w:pPr>
+      <w:r>
         <w:t>Kaynak ve bağlı belgeler</w:t>
       </w:r>
     </w:p>
     <w:p>
       <w:r>
-        <w:t>Kaynak: Stellantis MRS #5, V1.0, Doc-Info 01601_13_00117; sağlanan PDF s. 8, 9, 10, 11, 12, 13, 14, 15, 16, 17, 18, 19. NSA V8 eşlemesi, kullanıcının paylaştığı belge listesindeki referanstır; MRS kodlarıyla ayrı izlenir.</w:t>
+        <w:t>Kaynak: Stellantis MRS #5, V1.0, Doc-Info 01601_13_00117; sağlanan PDF s. 8, 9, 10, 11, 12, 13, 14, 15, 16, 17, 18, 19, 49, 53. NSA V8 eşlemesi, kullanıcının paylaştığı belge listesindeki referanstır; MRS kodlarıyla ayrı izlenir.</w:t>
       </w:r>
     </w:p>
     <w:p>
       <w:r>
-        <w:t>Kriter izleme: SP&amp;EP11; SP&amp;EP12; SP&amp;EP13</w:t>
+        <w:t>Kriter izleme: SP&amp;EP11; SP&amp;EP12; SP&amp;EP13; MRS SP&amp;EPE1: başlangıç başarısızlıklarının takibi; MRS SP&amp;EPE3: başlangıç/ayar kaynaklı duruş ve hurdanın takibi</w:t>
       </w:r>
     </w:p>
     <w:sectPr>

</xml_diff>